<commit_message>
COPP 그림 300 DPI 업스케일 반영 (Fig 1/2/3/5)
Co-Authored-By: Claude Opus 4.8 <noreply@anthropic.com>
</commit_message>
<xml_diff>
--- a/submission/copp/manuscript_COPP.docx
+++ b/submission/copp/manuscript_COPP.docx
@@ -241,7 +241,7 @@
         <w:rPr/>
         <w:drawing>
           <wp:inline distT="0" distB="0" distL="0" distR="0">
-            <wp:extent cx="7200265" cy="3362325"/>
+            <wp:extent cx="7200265" cy="2152015"/>
             <wp:effectExtent l="0" t="0" r="0" b="0"/>
             <wp:docPr id="1" name="Image1"/>
             <wp:cNvGraphicFramePr>
@@ -265,7 +265,7 @@
                   <pic:spPr bwMode="auto">
                     <a:xfrm>
                       <a:off x="0" y="0"/>
-                      <a:ext cx="7200265" cy="3362325"/>
+                      <a:ext cx="7200265" cy="2152015"/>
                     </a:xfrm>
                     <a:prstGeom prst="rect">
                       <a:avLst/>
@@ -796,7 +796,7 @@
         <w:rPr/>
         <w:drawing>
           <wp:inline distT="0" distB="0" distL="0" distR="0">
-            <wp:extent cx="7200265" cy="2075815"/>
+            <wp:extent cx="7200265" cy="1329055"/>
             <wp:effectExtent l="0" t="0" r="0" b="0"/>
             <wp:docPr id="2" name="Image2"/>
             <wp:cNvGraphicFramePr>
@@ -820,7 +820,7 @@
                   <pic:spPr bwMode="auto">
                     <a:xfrm>
                       <a:off x="0" y="0"/>
-                      <a:ext cx="7200265" cy="2075815"/>
+                      <a:ext cx="7200265" cy="1329055"/>
                     </a:xfrm>
                     <a:prstGeom prst="rect">
                       <a:avLst/>
@@ -927,7 +927,7 @@
         <w:rPr/>
         <w:drawing>
           <wp:inline distT="0" distB="0" distL="0" distR="0">
-            <wp:extent cx="7200265" cy="4590415"/>
+            <wp:extent cx="7200265" cy="2938145"/>
             <wp:effectExtent l="0" t="0" r="0" b="0"/>
             <wp:docPr id="3" name="Image3"/>
             <wp:cNvGraphicFramePr>
@@ -951,7 +951,7 @@
                   <pic:spPr bwMode="auto">
                     <a:xfrm>
                       <a:off x="0" y="0"/>
-                      <a:ext cx="7200265" cy="4590415"/>
+                      <a:ext cx="7200265" cy="2938145"/>
                     </a:xfrm>
                     <a:prstGeom prst="rect">
                       <a:avLst/>
@@ -1025,7 +1025,7 @@
         <w:rPr/>
         <w:drawing>
           <wp:inline distT="0" distB="0" distL="0" distR="0">
-            <wp:extent cx="7200265" cy="11172825"/>
+            <wp:extent cx="7200265" cy="3575050"/>
             <wp:effectExtent l="0" t="0" r="0" b="0"/>
             <wp:docPr id="4" name="Image4"/>
             <wp:cNvGraphicFramePr>
@@ -1049,7 +1049,7 @@
                   <pic:spPr bwMode="auto">
                     <a:xfrm>
                       <a:off x="0" y="0"/>
-                      <a:ext cx="7200265" cy="11172825"/>
+                      <a:ext cx="7200265" cy="3575050"/>
                     </a:xfrm>
                     <a:prstGeom prst="rect">
                       <a:avLst/>
@@ -1134,7 +1134,7 @@
         <w:rPr/>
         <w:drawing>
           <wp:inline distT="0" distB="0" distL="0" distR="0">
-            <wp:extent cx="7200265" cy="3609975"/>
+            <wp:extent cx="7200265" cy="2310130"/>
             <wp:effectExtent l="0" t="0" r="0" b="0"/>
             <wp:docPr id="5" name="Image5"/>
             <wp:cNvGraphicFramePr>
@@ -1158,7 +1158,7 @@
                   <pic:spPr bwMode="auto">
                     <a:xfrm>
                       <a:off x="0" y="0"/>
-                      <a:ext cx="7200265" cy="3609975"/>
+                      <a:ext cx="7200265" cy="2310130"/>
                     </a:xfrm>
                     <a:prstGeom prst="rect">
                       <a:avLst/>
@@ -1243,7 +1243,7 @@
         <w:rPr/>
         <w:drawing>
           <wp:inline distT="0" distB="0" distL="0" distR="0">
-            <wp:extent cx="7200265" cy="12801600"/>
+            <wp:extent cx="7200265" cy="4096385"/>
             <wp:effectExtent l="0" t="0" r="0" b="0"/>
             <wp:docPr id="6" name="Image6"/>
             <wp:cNvGraphicFramePr>
@@ -1267,7 +1267,7 @@
                   <pic:spPr bwMode="auto">
                     <a:xfrm>
                       <a:off x="0" y="0"/>
-                      <a:ext cx="7200265" cy="12801600"/>
+                      <a:ext cx="7200265" cy="4096385"/>
                     </a:xfrm>
                     <a:prstGeom prst="rect">
                       <a:avLst/>
@@ -1363,7 +1363,7 @@
         <w:rPr/>
         <w:drawing>
           <wp:inline distT="0" distB="0" distL="0" distR="0">
-            <wp:extent cx="7200265" cy="10515600"/>
+            <wp:extent cx="7200265" cy="3364865"/>
             <wp:effectExtent l="0" t="0" r="0" b="0"/>
             <wp:docPr id="7" name="Image7"/>
             <wp:cNvGraphicFramePr>
@@ -1387,7 +1387,7 @@
                   <pic:spPr bwMode="auto">
                     <a:xfrm>
                       <a:off x="0" y="0"/>
-                      <a:ext cx="7200265" cy="10515600"/>
+                      <a:ext cx="7200265" cy="3364865"/>
                     </a:xfrm>
                     <a:prstGeom prst="rect">
                       <a:avLst/>
@@ -1461,7 +1461,7 @@
         <w:rPr/>
         <w:drawing>
           <wp:inline distT="0" distB="0" distL="0" distR="0">
-            <wp:extent cx="7200265" cy="10067925"/>
+            <wp:extent cx="7200265" cy="3221355"/>
             <wp:effectExtent l="0" t="0" r="0" b="0"/>
             <wp:docPr id="8" name="Image8"/>
             <wp:cNvGraphicFramePr>
@@ -1485,7 +1485,7 @@
                   <pic:spPr bwMode="auto">
                     <a:xfrm>
                       <a:off x="0" y="0"/>
-                      <a:ext cx="7200265" cy="10067925"/>
+                      <a:ext cx="7200265" cy="3221355"/>
                     </a:xfrm>
                     <a:prstGeom prst="rect">
                       <a:avLst/>

</xml_diff>